<commit_message>
Final Updated With Steps and Jupyter Notebook
</commit_message>
<xml_diff>
--- a/3_Projects_Presentations/Final Project.docx
+++ b/3_Projects_Presentations/Final Project.docx
@@ -218,7 +218,7 @@
           <w:noProof/>
         </w:rPr>
         <w:drawing>
-          <wp:anchor distT="0" distB="0" distL="114300" distR="114300" simplePos="0" relativeHeight="251659264" behindDoc="0" locked="0" layoutInCell="1" allowOverlap="0" wp14:anchorId="43F5BD04" wp14:editId="45610E35">
+          <wp:anchor distT="0" distB="0" distL="114300" distR="114300" simplePos="0" relativeHeight="251659264" behindDoc="0" locked="0" layoutInCell="1" allowOverlap="0" wp14:anchorId="43F5BD04" wp14:editId="3A4F0327">
             <wp:simplePos x="0" y="0"/>
             <wp:positionH relativeFrom="page">
               <wp:posOffset>0</wp:posOffset>
@@ -3060,6 +3060,84 @@
           <w:sz w:val="23"/>
         </w:rPr>
       </w:pPr>
+      <w:r>
+        <w:rPr>
+          <w:rFonts w:ascii="Times New Roman" w:eastAsia="Times New Roman" w:hAnsi="Times New Roman" w:cs="Times New Roman"/>
+          <w:sz w:val="23"/>
+        </w:rPr>
+        <w:t xml:space="preserve"># </w:t>
+      </w:r>
+      <w:proofErr w:type="gramStart"/>
+      <w:r>
+        <w:rPr>
+          <w:rFonts w:ascii="Times New Roman" w:eastAsia="Times New Roman" w:hAnsi="Times New Roman" w:cs="Times New Roman"/>
+          <w:sz w:val="23"/>
+        </w:rPr>
+        <w:t>display</w:t>
+      </w:r>
+      <w:proofErr w:type="gramEnd"/>
+      <w:r>
+        <w:rPr>
+          <w:rFonts w:ascii="Times New Roman" w:eastAsia="Times New Roman" w:hAnsi="Times New Roman" w:cs="Times New Roman"/>
+          <w:sz w:val="23"/>
+        </w:rPr>
+        <w:t xml:space="preserve"> all column names </w:t>
+      </w:r>
+    </w:p>
+    <w:p>
+      <w:pPr>
+        <w:spacing w:after="7" w:line="270" w:lineRule="auto"/>
+        <w:ind w:left="-5" w:right="515" w:hanging="10"/>
+        <w:rPr>
+          <w:rFonts w:ascii="Times New Roman" w:eastAsia="Times New Roman" w:hAnsi="Times New Roman" w:cs="Times New Roman"/>
+          <w:sz w:val="23"/>
+        </w:rPr>
+      </w:pPr>
+      <w:r>
+        <w:rPr>
+          <w:rFonts w:ascii="Times New Roman" w:eastAsia="Times New Roman" w:hAnsi="Times New Roman" w:cs="Times New Roman"/>
+          <w:sz w:val="23"/>
+        </w:rPr>
+        <w:t>print(</w:t>
+      </w:r>
+      <w:proofErr w:type="spellStart"/>
+      <w:proofErr w:type="gramStart"/>
+      <w:r>
+        <w:rPr>
+          <w:rFonts w:ascii="Times New Roman" w:eastAsia="Times New Roman" w:hAnsi="Times New Roman" w:cs="Times New Roman"/>
+          <w:sz w:val="23"/>
+        </w:rPr>
+        <w:t>dataframe.columns</w:t>
+      </w:r>
+      <w:proofErr w:type="spellEnd"/>
+      <w:proofErr w:type="gramEnd"/>
+      <w:r>
+        <w:rPr>
+          <w:rFonts w:ascii="Times New Roman" w:eastAsia="Times New Roman" w:hAnsi="Times New Roman" w:cs="Times New Roman"/>
+          <w:sz w:val="23"/>
+        </w:rPr>
+        <w:t>)</w:t>
+      </w:r>
+    </w:p>
+    <w:p>
+      <w:pPr>
+        <w:spacing w:after="7" w:line="270" w:lineRule="auto"/>
+        <w:ind w:left="-5" w:right="515" w:hanging="10"/>
+        <w:rPr>
+          <w:rFonts w:ascii="Times New Roman" w:eastAsia="Times New Roman" w:hAnsi="Times New Roman" w:cs="Times New Roman"/>
+          <w:sz w:val="23"/>
+        </w:rPr>
+      </w:pPr>
+    </w:p>
+    <w:p>
+      <w:pPr>
+        <w:spacing w:after="7" w:line="270" w:lineRule="auto"/>
+        <w:ind w:left="-5" w:right="515" w:hanging="10"/>
+        <w:rPr>
+          <w:rFonts w:ascii="Times New Roman" w:eastAsia="Times New Roman" w:hAnsi="Times New Roman" w:cs="Times New Roman"/>
+          <w:sz w:val="23"/>
+        </w:rPr>
+      </w:pPr>
       <w:proofErr w:type="spellStart"/>
       <w:r>
         <w:rPr>
@@ -3455,6 +3533,7 @@
     <w:p/>
     <w:p>
       <w:r>
+        <w:lastRenderedPageBreak/>
         <w:t>This helps identify:</w:t>
       </w:r>
     </w:p>
@@ -3477,7 +3556,6 @@
         </w:numPr>
       </w:pPr>
       <w:r>
-        <w:lastRenderedPageBreak/>
         <w:t>Data types</w:t>
       </w:r>
     </w:p>
@@ -4160,6 +4238,22 @@
           <w:b/>
           <w:bCs/>
         </w:rPr>
+        <w:br w:type="page"/>
+      </w:r>
+    </w:p>
+    <w:p>
+      <w:pPr>
+        <w:rPr>
+          <w:b/>
+          <w:bCs/>
+        </w:rPr>
+      </w:pPr>
+      <w:r>
+        <w:rPr>
+          <w:b/>
+          <w:bCs/>
+        </w:rPr>
+        <w:lastRenderedPageBreak/>
         <w:t>CHAPTER 7: HANDLING MISSING DATA AND OUTLIERS</w:t>
       </w:r>
     </w:p>
@@ -4488,7 +4582,6 @@
           <w:bCs/>
           <w:noProof/>
         </w:rPr>
-        <w:lastRenderedPageBreak/>
         <w:drawing>
           <wp:inline distT="0" distB="0" distL="0" distR="0" wp14:anchorId="05AE2781" wp14:editId="719D2CFB">
             <wp:extent cx="5731510" cy="2704465"/>
@@ -4581,6 +4674,7 @@
     </w:p>
     <w:p>
       <w:r>
+        <w:lastRenderedPageBreak/>
         <w:t>--OP—</w:t>
       </w:r>
     </w:p>
@@ -7212,6 +7306,16 @@
       <w:proofErr w:type="gramEnd"/>
       <w:r>
         <w:t>"R2 Score:", r2)</w:t>
+      </w:r>
+    </w:p>
+    <w:p>
+      <w:r>
+        <w:t>--OP of MAE, MSE, R2</w:t>
+      </w:r>
+    </w:p>
+    <w:p>
+      <w:r>
+        <w:t>-- Evaluation Result</w:t>
       </w:r>
     </w:p>
     <w:p/>
@@ -9664,7 +9768,6 @@
   <w:style w:type="character" w:default="1" w:styleId="DefaultParagraphFont">
     <w:name w:val="Default Paragraph Font"/>
     <w:uiPriority w:val="1"/>
-    <w:semiHidden/>
     <w:unhideWhenUsed/>
   </w:style>
   <w:style w:type="table" w:default="1" w:styleId="TableNormal">

</xml_diff>